<commit_message>
font style changed to 12 times new roman
</commit_message>
<xml_diff>
--- a/assessement2/apastyleformataigenerated.docx
+++ b/assessement2/apastyleformataigenerated.docx
@@ -3,93 +3,175 @@
 <w:document xmlns:wpc="http://schemas.microsoft.com/office/word/2010/wordprocessingCanvas" xmlns:cx="http://schemas.microsoft.com/office/drawing/2014/chartex" xmlns:cx1="http://schemas.microsoft.com/office/drawing/2015/9/8/chartex" xmlns:cx2="http://schemas.microsoft.com/office/drawing/2015/10/21/chartex" xmlns:cx3="http://schemas.microsoft.com/office/drawing/2016/5/9/chartex" xmlns:cx4="http://schemas.microsoft.com/office/drawing/2016/5/10/chartex" xmlns:cx5="http://schemas.microsoft.com/office/drawing/2016/5/11/chartex" xmlns:cx6="http://schemas.microsoft.com/office/drawing/2016/5/12/chartex" xmlns:cx7="http://schemas.microsoft.com/office/drawing/2016/5/13/chartex" xmlns:cx8="http://schemas.microsoft.com/office/drawing/2016/5/14/chartex" xmlns:mc="http://schemas.openxmlformats.org/markup-compatibility/2006" xmlns:aink="http://schemas.microsoft.com/office/drawing/2016/ink" xmlns:am3d="http://schemas.microsoft.com/office/drawing/2017/model3d" xmlns:o="urn:schemas-microsoft-com:office:office" xmlns:oel="http://schemas.microsoft.com/office/2019/extlst" xmlns:r="http://schemas.openxmlformats.org/officeDocument/2006/relationships" xmlns:m="http://schemas.openxmlformats.org/officeDocument/2006/math" xmlns:v="urn:schemas-microsoft-com:vml" xmlns:wp14="http://schemas.microsoft.com/office/word/2010/wordprocessingDrawing" xmlns:wp="http://schemas.openxmlformats.org/drawingml/2006/wordprocessingDrawing" xmlns:w10="urn:schemas-microsoft-com:office:word" xmlns:w="http://schemas.openxmlformats.org/wordprocessingml/2006/main" xmlns:w14="http://schemas.microsoft.com/office/word/2010/wordml" xmlns:w15="http://schemas.microsoft.com/office/word/2012/wordml" xmlns:w16cex="http://schemas.microsoft.com/office/word/2018/wordml/cex" xmlns:w16cid="http://schemas.microsoft.com/office/word/2016/wordml/cid" xmlns:w16="http://schemas.microsoft.com/office/word/2018/wordml" xmlns:w16du="http://schemas.microsoft.com/office/word/2023/wordml/word16du" xmlns:w16sdtdh="http://schemas.microsoft.com/office/word/2020/wordml/sdtdatahash" xmlns:w16sdtfl="http://schemas.microsoft.com/office/word/2024/wordml/sdtformatlock" xmlns:w16se="http://schemas.microsoft.com/office/word/2015/wordml/symex" xmlns:wpg="http://schemas.microsoft.com/office/word/2010/wordprocessingGroup" xmlns:wpi="http://schemas.microsoft.com/office/word/2010/wordprocessingInk" xmlns:wne="http://schemas.microsoft.com/office/word/2006/wordml" xmlns:wps="http://schemas.microsoft.com/office/word/2010/wordprocessingShape" mc:Ignorable="w14 w15 w16se w16cid w16 w16cex w16sdtdh w16sdtfl w16du wp14">
   <w:body>
     <w:p>
-      <w:r>
-        <w:rPr>
-          <w:b/>
-          <w:bCs/>
+      <w:pPr>
+        <w:rPr>
+          <w:rFonts w:ascii="Times New Roman" w:hAnsi="Times New Roman" w:cs="Times New Roman"/>
+          <w:sz w:val="24"/>
+          <w:szCs w:val="24"/>
+        </w:rPr>
+      </w:pPr>
+      <w:r>
+        <w:rPr>
+          <w:rFonts w:ascii="Times New Roman" w:hAnsi="Times New Roman" w:cs="Times New Roman"/>
+          <w:b/>
+          <w:bCs/>
+          <w:sz w:val="24"/>
+          <w:szCs w:val="24"/>
         </w:rPr>
         <w:t xml:space="preserve">Vulnerability Management Policy and Patch Management Policy </w:t>
       </w:r>
       <w:proofErr w:type="gramStart"/>
       <w:r>
         <w:rPr>
-          <w:b/>
-          <w:bCs/>
+          <w:rFonts w:ascii="Times New Roman" w:hAnsi="Times New Roman" w:cs="Times New Roman"/>
+          <w:b/>
+          <w:bCs/>
+          <w:sz w:val="24"/>
+          <w:szCs w:val="24"/>
         </w:rPr>
         <w:t>With</w:t>
       </w:r>
       <w:proofErr w:type="gramEnd"/>
       <w:r>
         <w:rPr>
-          <w:b/>
-          <w:bCs/>
+          <w:rFonts w:ascii="Times New Roman" w:hAnsi="Times New Roman" w:cs="Times New Roman"/>
+          <w:b/>
+          <w:bCs/>
+          <w:sz w:val="24"/>
+          <w:szCs w:val="24"/>
         </w:rPr>
         <w:t xml:space="preserve"> AI Critique</w:t>
       </w:r>
       <w:r>
+        <w:rPr>
+          <w:rFonts w:ascii="Times New Roman" w:hAnsi="Times New Roman" w:cs="Times New Roman"/>
+          <w:sz w:val="24"/>
+          <w:szCs w:val="24"/>
+        </w:rPr>
         <w:br/>
       </w:r>
     </w:p>
     <w:p>
-      <w:r>
+      <w:pPr>
+        <w:rPr>
+          <w:rFonts w:ascii="Times New Roman" w:hAnsi="Times New Roman" w:cs="Times New Roman"/>
+          <w:sz w:val="24"/>
+          <w:szCs w:val="24"/>
+        </w:rPr>
+      </w:pPr>
+      <w:r>
+        <w:rPr>
+          <w:rFonts w:ascii="Times New Roman" w:hAnsi="Times New Roman" w:cs="Times New Roman"/>
+          <w:sz w:val="24"/>
+          <w:szCs w:val="24"/>
+        </w:rPr>
         <w:t xml:space="preserve">Alan </w:t>
       </w:r>
       <w:proofErr w:type="spellStart"/>
       <w:r>
+        <w:rPr>
+          <w:rFonts w:ascii="Times New Roman" w:hAnsi="Times New Roman" w:cs="Times New Roman"/>
+          <w:sz w:val="24"/>
+          <w:szCs w:val="24"/>
+        </w:rPr>
         <w:t>Chackalakkal</w:t>
       </w:r>
       <w:proofErr w:type="spellEnd"/>
       <w:r>
+        <w:rPr>
+          <w:rFonts w:ascii="Times New Roman" w:hAnsi="Times New Roman" w:cs="Times New Roman"/>
+          <w:sz w:val="24"/>
+          <w:szCs w:val="24"/>
+        </w:rPr>
         <w:br/>
         <w:t>University Name</w:t>
       </w:r>
       <w:r>
+        <w:rPr>
+          <w:rFonts w:ascii="Times New Roman" w:hAnsi="Times New Roman" w:cs="Times New Roman"/>
+          <w:sz w:val="24"/>
+          <w:szCs w:val="24"/>
+        </w:rPr>
         <w:br/>
         <w:t>Course Name</w:t>
       </w:r>
       <w:r>
+        <w:rPr>
+          <w:rFonts w:ascii="Times New Roman" w:hAnsi="Times New Roman" w:cs="Times New Roman"/>
+          <w:sz w:val="24"/>
+          <w:szCs w:val="24"/>
+        </w:rPr>
         <w:br/>
         <w:t>Instructor Name</w:t>
       </w:r>
       <w:r>
+        <w:rPr>
+          <w:rFonts w:ascii="Times New Roman" w:hAnsi="Times New Roman" w:cs="Times New Roman"/>
+          <w:sz w:val="24"/>
+          <w:szCs w:val="24"/>
+        </w:rPr>
         <w:br/>
         <w:t>Date</w:t>
       </w:r>
     </w:p>
     <w:p>
-      <w:r>
+      <w:pPr>
+        <w:rPr>
+          <w:rFonts w:ascii="Times New Roman" w:hAnsi="Times New Roman" w:cs="Times New Roman"/>
+          <w:sz w:val="24"/>
+          <w:szCs w:val="24"/>
+        </w:rPr>
+      </w:pPr>
+      <w:r>
+        <w:rPr>
+          <w:rFonts w:ascii="Times New Roman" w:hAnsi="Times New Roman" w:cs="Times New Roman"/>
+          <w:sz w:val="24"/>
+          <w:szCs w:val="24"/>
+        </w:rPr>
         <w:pict w14:anchorId="79247AB4">
-          <v:rect id="_x0000_i1079" style="width:0;height:1.5pt" o:hralign="center" o:hrstd="t" o:hr="t" fillcolor="#a0a0a0" stroked="f"/>
+          <v:rect id="_x0000_i1025" style="width:0;height:1.5pt" o:hralign="center" o:hrstd="t" o:hr="t" fillcolor="#a0a0a0" stroked="f"/>
         </w:pict>
       </w:r>
     </w:p>
     <w:p>
       <w:pPr>
         <w:rPr>
-          <w:b/>
-          <w:bCs/>
-        </w:rPr>
-      </w:pPr>
-      <w:r>
-        <w:rPr>
-          <w:b/>
-          <w:bCs/>
+          <w:rFonts w:ascii="Times New Roman" w:hAnsi="Times New Roman" w:cs="Times New Roman"/>
+          <w:b/>
+          <w:bCs/>
+          <w:sz w:val="24"/>
+          <w:szCs w:val="24"/>
+        </w:rPr>
+      </w:pPr>
+      <w:r>
+        <w:rPr>
+          <w:rFonts w:ascii="Times New Roman" w:hAnsi="Times New Roman" w:cs="Times New Roman"/>
+          <w:b/>
+          <w:bCs/>
+          <w:sz w:val="24"/>
+          <w:szCs w:val="24"/>
         </w:rPr>
         <w:t xml:space="preserve"> Vulnerability Management Policy </w:t>
       </w:r>
       <w:proofErr w:type="gramStart"/>
       <w:r>
         <w:rPr>
-          <w:b/>
-          <w:bCs/>
+          <w:rFonts w:ascii="Times New Roman" w:hAnsi="Times New Roman" w:cs="Times New Roman"/>
+          <w:b/>
+          <w:bCs/>
+          <w:sz w:val="24"/>
+          <w:szCs w:val="24"/>
         </w:rPr>
         <w:t>With</w:t>
       </w:r>
       <w:proofErr w:type="gramEnd"/>
       <w:r>
         <w:rPr>
-          <w:b/>
-          <w:bCs/>
+          <w:rFonts w:ascii="Times New Roman" w:hAnsi="Times New Roman" w:cs="Times New Roman"/>
+          <w:b/>
+          <w:bCs/>
+          <w:sz w:val="24"/>
+          <w:szCs w:val="24"/>
         </w:rPr>
         <w:t xml:space="preserve"> AI Critique</w:t>
       </w:r>
@@ -97,14 +179,20 @@
     <w:p>
       <w:pPr>
         <w:rPr>
-          <w:b/>
-          <w:bCs/>
-        </w:rPr>
-      </w:pPr>
-      <w:r>
-        <w:rPr>
-          <w:b/>
-          <w:bCs/>
+          <w:rFonts w:ascii="Times New Roman" w:hAnsi="Times New Roman" w:cs="Times New Roman"/>
+          <w:b/>
+          <w:bCs/>
+          <w:sz w:val="24"/>
+          <w:szCs w:val="24"/>
+        </w:rPr>
+      </w:pPr>
+      <w:r>
+        <w:rPr>
+          <w:rFonts w:ascii="Times New Roman" w:hAnsi="Times New Roman" w:cs="Times New Roman"/>
+          <w:b/>
+          <w:bCs/>
+          <w:sz w:val="24"/>
+          <w:szCs w:val="24"/>
         </w:rPr>
         <w:t>AI-Generated Draft: Vulnerability Management Policy</w:t>
       </w:r>
@@ -112,97 +200,194 @@
     <w:p>
       <w:pPr>
         <w:rPr>
-          <w:b/>
-          <w:bCs/>
-        </w:rPr>
-      </w:pPr>
-      <w:r>
-        <w:rPr>
-          <w:b/>
-          <w:bCs/>
+          <w:rFonts w:ascii="Times New Roman" w:hAnsi="Times New Roman" w:cs="Times New Roman"/>
+          <w:b/>
+          <w:bCs/>
+          <w:sz w:val="24"/>
+          <w:szCs w:val="24"/>
+        </w:rPr>
+      </w:pPr>
+      <w:r>
+        <w:rPr>
+          <w:rFonts w:ascii="Times New Roman" w:hAnsi="Times New Roman" w:cs="Times New Roman"/>
+          <w:b/>
+          <w:bCs/>
+          <w:sz w:val="24"/>
+          <w:szCs w:val="24"/>
         </w:rPr>
         <w:t>Purpose</w:t>
       </w:r>
     </w:p>
     <w:p>
-      <w:r>
+      <w:pPr>
+        <w:rPr>
+          <w:rFonts w:ascii="Times New Roman" w:hAnsi="Times New Roman" w:cs="Times New Roman"/>
+          <w:sz w:val="24"/>
+          <w:szCs w:val="24"/>
+        </w:rPr>
+      </w:pPr>
+      <w:r>
+        <w:rPr>
+          <w:rFonts w:ascii="Times New Roman" w:hAnsi="Times New Roman" w:cs="Times New Roman"/>
+          <w:sz w:val="24"/>
+          <w:szCs w:val="24"/>
+        </w:rPr>
         <w:t xml:space="preserve">The purpose of this </w:t>
       </w:r>
       <w:proofErr w:type="spellStart"/>
       <w:r>
+        <w:rPr>
+          <w:rFonts w:ascii="Times New Roman" w:hAnsi="Times New Roman" w:cs="Times New Roman"/>
+          <w:sz w:val="24"/>
+          <w:szCs w:val="24"/>
+        </w:rPr>
         <w:t>poli</w:t>
       </w:r>
       <w:r>
+        <w:rPr>
+          <w:rFonts w:ascii="Times New Roman" w:hAnsi="Times New Roman" w:cs="Times New Roman"/>
+          <w:sz w:val="24"/>
+          <w:szCs w:val="24"/>
+        </w:rPr>
         <w:t>S</w:t>
       </w:r>
       <w:r>
+        <w:rPr>
+          <w:rFonts w:ascii="Times New Roman" w:hAnsi="Times New Roman" w:cs="Times New Roman"/>
+          <w:sz w:val="24"/>
+          <w:szCs w:val="24"/>
+        </w:rPr>
         <w:t>cy</w:t>
       </w:r>
       <w:proofErr w:type="spellEnd"/>
       <w:r>
+        <w:rPr>
+          <w:rFonts w:ascii="Times New Roman" w:hAnsi="Times New Roman" w:cs="Times New Roman"/>
+          <w:sz w:val="24"/>
+          <w:szCs w:val="24"/>
+        </w:rPr>
         <w:t xml:space="preserve"> is to ensure that vulnerabilities within the organization’s systems are identified and remediated in a timely manner to reduce security risks.</w:t>
       </w:r>
     </w:p>
     <w:p>
       <w:pPr>
         <w:rPr>
-          <w:b/>
-          <w:bCs/>
-        </w:rPr>
-      </w:pPr>
-      <w:r>
-        <w:rPr>
-          <w:b/>
-          <w:bCs/>
+          <w:rFonts w:ascii="Times New Roman" w:hAnsi="Times New Roman" w:cs="Times New Roman"/>
+          <w:b/>
+          <w:bCs/>
+          <w:sz w:val="24"/>
+          <w:szCs w:val="24"/>
+        </w:rPr>
+      </w:pPr>
+      <w:r>
+        <w:rPr>
+          <w:rFonts w:ascii="Times New Roman" w:hAnsi="Times New Roman" w:cs="Times New Roman"/>
+          <w:b/>
+          <w:bCs/>
+          <w:sz w:val="24"/>
+          <w:szCs w:val="24"/>
         </w:rPr>
         <w:t>Scope</w:t>
       </w:r>
     </w:p>
     <w:p>
-      <w:r>
+      <w:pPr>
+        <w:rPr>
+          <w:rFonts w:ascii="Times New Roman" w:hAnsi="Times New Roman" w:cs="Times New Roman"/>
+          <w:sz w:val="24"/>
+          <w:szCs w:val="24"/>
+        </w:rPr>
+      </w:pPr>
+      <w:r>
+        <w:rPr>
+          <w:rFonts w:ascii="Times New Roman" w:hAnsi="Times New Roman" w:cs="Times New Roman"/>
+          <w:sz w:val="24"/>
+          <w:szCs w:val="24"/>
+        </w:rPr>
         <w:t>This policy applies to all systems, servers, applications, and network devices owned or managed by the organization.</w:t>
       </w:r>
     </w:p>
     <w:p>
       <w:pPr>
         <w:rPr>
-          <w:b/>
-          <w:bCs/>
-        </w:rPr>
-      </w:pPr>
-      <w:r>
-        <w:rPr>
-          <w:b/>
-          <w:bCs/>
+          <w:rFonts w:ascii="Times New Roman" w:hAnsi="Times New Roman" w:cs="Times New Roman"/>
+          <w:b/>
+          <w:bCs/>
+          <w:sz w:val="24"/>
+          <w:szCs w:val="24"/>
+        </w:rPr>
+      </w:pPr>
+      <w:r>
+        <w:rPr>
+          <w:rFonts w:ascii="Times New Roman" w:hAnsi="Times New Roman" w:cs="Times New Roman"/>
+          <w:b/>
+          <w:bCs/>
+          <w:sz w:val="24"/>
+          <w:szCs w:val="24"/>
         </w:rPr>
         <w:t>Policy Statement</w:t>
       </w:r>
     </w:p>
     <w:p>
-      <w:r>
+      <w:pPr>
+        <w:rPr>
+          <w:rFonts w:ascii="Times New Roman" w:hAnsi="Times New Roman" w:cs="Times New Roman"/>
+          <w:sz w:val="24"/>
+          <w:szCs w:val="24"/>
+        </w:rPr>
+      </w:pPr>
+      <w:r>
+        <w:rPr>
+          <w:rFonts w:ascii="Times New Roman" w:hAnsi="Times New Roman" w:cs="Times New Roman"/>
+          <w:sz w:val="24"/>
+          <w:szCs w:val="24"/>
+        </w:rPr>
         <w:t>The organization will conduct regular vulnerability scans to identify security weaknesses. Vulnerabilities will be assessed based on severity and addressed accordingly. Critical vulnerabilities should be addressed as soon as possible.</w:t>
       </w:r>
     </w:p>
     <w:p>
       <w:pPr>
         <w:rPr>
-          <w:b/>
-          <w:bCs/>
-        </w:rPr>
-      </w:pPr>
-      <w:r>
-        <w:rPr>
-          <w:b/>
-          <w:bCs/>
+          <w:rFonts w:ascii="Times New Roman" w:hAnsi="Times New Roman" w:cs="Times New Roman"/>
+          <w:b/>
+          <w:bCs/>
+          <w:sz w:val="24"/>
+          <w:szCs w:val="24"/>
+        </w:rPr>
+      </w:pPr>
+      <w:r>
+        <w:rPr>
+          <w:rFonts w:ascii="Times New Roman" w:hAnsi="Times New Roman" w:cs="Times New Roman"/>
+          <w:b/>
+          <w:bCs/>
+          <w:sz w:val="24"/>
+          <w:szCs w:val="24"/>
         </w:rPr>
         <w:t>Roles and Responsibilities</w:t>
       </w:r>
     </w:p>
     <w:p>
-      <w:r>
+      <w:pPr>
+        <w:rPr>
+          <w:rFonts w:ascii="Times New Roman" w:hAnsi="Times New Roman" w:cs="Times New Roman"/>
+          <w:sz w:val="24"/>
+          <w:szCs w:val="24"/>
+        </w:rPr>
+      </w:pPr>
+      <w:r>
+        <w:rPr>
+          <w:rFonts w:ascii="Times New Roman" w:hAnsi="Times New Roman" w:cs="Times New Roman"/>
+          <w:sz w:val="24"/>
+          <w:szCs w:val="24"/>
+        </w:rPr>
         <w:t>IT Team: Conduct scans and remediate vulnerabilities.</w:t>
       </w:r>
       <w:r>
+        <w:rPr>
+          <w:rFonts w:ascii="Times New Roman" w:hAnsi="Times New Roman" w:cs="Times New Roman"/>
+          <w:sz w:val="24"/>
+          <w:szCs w:val="24"/>
+        </w:rPr>
         <w:br/>
         <w:t>Management: Oversee vulnerability management activities.</w:t>
       </w:r>
@@ -210,47 +395,95 @@
     <w:p>
       <w:pPr>
         <w:rPr>
-          <w:b/>
-          <w:bCs/>
-        </w:rPr>
-      </w:pPr>
-      <w:r>
-        <w:rPr>
-          <w:b/>
-          <w:bCs/>
+          <w:rFonts w:ascii="Times New Roman" w:hAnsi="Times New Roman" w:cs="Times New Roman"/>
+          <w:b/>
+          <w:bCs/>
+          <w:sz w:val="24"/>
+          <w:szCs w:val="24"/>
+        </w:rPr>
+      </w:pPr>
+      <w:r>
+        <w:rPr>
+          <w:rFonts w:ascii="Times New Roman" w:hAnsi="Times New Roman" w:cs="Times New Roman"/>
+          <w:b/>
+          <w:bCs/>
+          <w:sz w:val="24"/>
+          <w:szCs w:val="24"/>
         </w:rPr>
         <w:t>Review</w:t>
       </w:r>
     </w:p>
     <w:p>
-      <w:r>
+      <w:pPr>
+        <w:rPr>
+          <w:rFonts w:ascii="Times New Roman" w:hAnsi="Times New Roman" w:cs="Times New Roman"/>
+          <w:sz w:val="24"/>
+          <w:szCs w:val="24"/>
+        </w:rPr>
+      </w:pPr>
+      <w:r>
+        <w:rPr>
+          <w:rFonts w:ascii="Times New Roman" w:hAnsi="Times New Roman" w:cs="Times New Roman"/>
+          <w:sz w:val="24"/>
+          <w:szCs w:val="24"/>
+        </w:rPr>
         <w:t>This policy will be reviewed annually.</w:t>
       </w:r>
     </w:p>
     <w:p>
-      <w:r>
+      <w:pPr>
+        <w:rPr>
+          <w:rFonts w:ascii="Times New Roman" w:hAnsi="Times New Roman" w:cs="Times New Roman"/>
+          <w:sz w:val="24"/>
+          <w:szCs w:val="24"/>
+        </w:rPr>
+      </w:pPr>
+      <w:r>
+        <w:rPr>
+          <w:rFonts w:ascii="Times New Roman" w:hAnsi="Times New Roman" w:cs="Times New Roman"/>
+          <w:sz w:val="24"/>
+          <w:szCs w:val="24"/>
+        </w:rPr>
         <w:pict w14:anchorId="07844D2C">
-          <v:rect id="_x0000_i1080" style="width:0;height:1.5pt" o:hralign="center" o:hrstd="t" o:hr="t" fillcolor="#a0a0a0" stroked="f"/>
+          <v:rect id="_x0000_i1026" style="width:0;height:1.5pt" o:hralign="center" o:hrstd="t" o:hr="t" fillcolor="#a0a0a0" stroked="f"/>
         </w:pict>
       </w:r>
     </w:p>
     <w:p>
       <w:pPr>
         <w:rPr>
-          <w:b/>
-          <w:bCs/>
-        </w:rPr>
-      </w:pPr>
-      <w:r>
-        <w:rPr>
-          <w:b/>
-          <w:bCs/>
+          <w:rFonts w:ascii="Times New Roman" w:hAnsi="Times New Roman" w:cs="Times New Roman"/>
+          <w:b/>
+          <w:bCs/>
+          <w:sz w:val="24"/>
+          <w:szCs w:val="24"/>
+        </w:rPr>
+      </w:pPr>
+      <w:r>
+        <w:rPr>
+          <w:rFonts w:ascii="Times New Roman" w:hAnsi="Times New Roman" w:cs="Times New Roman"/>
+          <w:b/>
+          <w:bCs/>
+          <w:sz w:val="24"/>
+          <w:szCs w:val="24"/>
         </w:rPr>
         <w:t>AI Critique and Annotations</w:t>
       </w:r>
     </w:p>
     <w:p>
-      <w:r>
+      <w:pPr>
+        <w:rPr>
+          <w:rFonts w:ascii="Times New Roman" w:hAnsi="Times New Roman" w:cs="Times New Roman"/>
+          <w:sz w:val="24"/>
+          <w:szCs w:val="24"/>
+        </w:rPr>
+      </w:pPr>
+      <w:r>
+        <w:rPr>
+          <w:rFonts w:ascii="Times New Roman" w:hAnsi="Times New Roman" w:cs="Times New Roman"/>
+          <w:sz w:val="24"/>
+          <w:szCs w:val="24"/>
+        </w:rPr>
         <w:t>The AI-generated draft provided a foundational structure but lacked specificity and compliance alignment. Several weaknesses were identified:</w:t>
       </w:r>
     </w:p>
@@ -260,8 +493,18 @@
           <w:ilvl w:val="0"/>
           <w:numId w:val="1"/>
         </w:numPr>
-      </w:pPr>
-      <w:r>
+        <w:rPr>
+          <w:rFonts w:ascii="Times New Roman" w:hAnsi="Times New Roman" w:cs="Times New Roman"/>
+          <w:sz w:val="24"/>
+          <w:szCs w:val="24"/>
+        </w:rPr>
+      </w:pPr>
+      <w:r>
+        <w:rPr>
+          <w:rFonts w:ascii="Times New Roman" w:hAnsi="Times New Roman" w:cs="Times New Roman"/>
+          <w:sz w:val="24"/>
+          <w:szCs w:val="24"/>
+        </w:rPr>
         <w:t>The draft did not reference recognized cybersecurity frameworks such as NIST SP 800-40 or ISO/IEC 27001.</w:t>
       </w:r>
     </w:p>
@@ -271,8 +514,18 @@
           <w:ilvl w:val="0"/>
           <w:numId w:val="1"/>
         </w:numPr>
-      </w:pPr>
-      <w:r>
+        <w:rPr>
+          <w:rFonts w:ascii="Times New Roman" w:hAnsi="Times New Roman" w:cs="Times New Roman"/>
+          <w:sz w:val="24"/>
+          <w:szCs w:val="24"/>
+        </w:rPr>
+      </w:pPr>
+      <w:r>
+        <w:rPr>
+          <w:rFonts w:ascii="Times New Roman" w:hAnsi="Times New Roman" w:cs="Times New Roman"/>
+          <w:sz w:val="24"/>
+          <w:szCs w:val="24"/>
+        </w:rPr>
         <w:t>Remediation timelines were vague and not measurable.</w:t>
       </w:r>
     </w:p>
@@ -282,8 +535,18 @@
           <w:ilvl w:val="0"/>
           <w:numId w:val="1"/>
         </w:numPr>
-      </w:pPr>
-      <w:r>
+        <w:rPr>
+          <w:rFonts w:ascii="Times New Roman" w:hAnsi="Times New Roman" w:cs="Times New Roman"/>
+          <w:sz w:val="24"/>
+          <w:szCs w:val="24"/>
+        </w:rPr>
+      </w:pPr>
+      <w:r>
+        <w:rPr>
+          <w:rFonts w:ascii="Times New Roman" w:hAnsi="Times New Roman" w:cs="Times New Roman"/>
+          <w:sz w:val="24"/>
+          <w:szCs w:val="24"/>
+        </w:rPr>
         <w:t>The severity classification methodology was undefined.</w:t>
       </w:r>
     </w:p>
@@ -293,8 +556,18 @@
           <w:ilvl w:val="0"/>
           <w:numId w:val="1"/>
         </w:numPr>
-      </w:pPr>
-      <w:r>
+        <w:rPr>
+          <w:rFonts w:ascii="Times New Roman" w:hAnsi="Times New Roman" w:cs="Times New Roman"/>
+          <w:sz w:val="24"/>
+          <w:szCs w:val="24"/>
+        </w:rPr>
+      </w:pPr>
+      <w:r>
+        <w:rPr>
+          <w:rFonts w:ascii="Times New Roman" w:hAnsi="Times New Roman" w:cs="Times New Roman"/>
+          <w:sz w:val="24"/>
+          <w:szCs w:val="24"/>
+        </w:rPr>
         <w:t>Roles and responsibilities were not clearly differentiated.</w:t>
       </w:r>
     </w:p>
@@ -304,35 +577,75 @@
           <w:ilvl w:val="0"/>
           <w:numId w:val="1"/>
         </w:numPr>
-      </w:pPr>
-      <w:r>
+        <w:rPr>
+          <w:rFonts w:ascii="Times New Roman" w:hAnsi="Times New Roman" w:cs="Times New Roman"/>
+          <w:sz w:val="24"/>
+          <w:szCs w:val="24"/>
+        </w:rPr>
+      </w:pPr>
+      <w:r>
+        <w:rPr>
+          <w:rFonts w:ascii="Times New Roman" w:hAnsi="Times New Roman" w:cs="Times New Roman"/>
+          <w:sz w:val="24"/>
+          <w:szCs w:val="24"/>
+        </w:rPr>
         <w:t>Reporting and documentation requirements were absent.</w:t>
       </w:r>
     </w:p>
     <w:p>
-      <w:r>
+      <w:pPr>
+        <w:rPr>
+          <w:rFonts w:ascii="Times New Roman" w:hAnsi="Times New Roman" w:cs="Times New Roman"/>
+          <w:sz w:val="24"/>
+          <w:szCs w:val="24"/>
+        </w:rPr>
+      </w:pPr>
+      <w:r>
+        <w:rPr>
+          <w:rFonts w:ascii="Times New Roman" w:hAnsi="Times New Roman" w:cs="Times New Roman"/>
+          <w:sz w:val="24"/>
+          <w:szCs w:val="24"/>
+        </w:rPr>
         <w:lastRenderedPageBreak/>
         <w:t>These issues were addressed in the revised version below.</w:t>
       </w:r>
     </w:p>
     <w:p>
-      <w:r>
+      <w:pPr>
+        <w:rPr>
+          <w:rFonts w:ascii="Times New Roman" w:hAnsi="Times New Roman" w:cs="Times New Roman"/>
+          <w:sz w:val="24"/>
+          <w:szCs w:val="24"/>
+        </w:rPr>
+      </w:pPr>
+      <w:r>
+        <w:rPr>
+          <w:rFonts w:ascii="Times New Roman" w:hAnsi="Times New Roman" w:cs="Times New Roman"/>
+          <w:sz w:val="24"/>
+          <w:szCs w:val="24"/>
+        </w:rPr>
         <w:pict w14:anchorId="7991352C">
-          <v:rect id="_x0000_i1081" style="width:0;height:1.5pt" o:hralign="center" o:hrstd="t" o:hr="t" fillcolor="#a0a0a0" stroked="f"/>
+          <v:rect id="_x0000_i1027" style="width:0;height:1.5pt" o:hralign="center" o:hrstd="t" o:hr="t" fillcolor="#a0a0a0" stroked="f"/>
         </w:pict>
       </w:r>
     </w:p>
     <w:p>
       <w:pPr>
         <w:rPr>
-          <w:b/>
-          <w:bCs/>
-        </w:rPr>
-      </w:pPr>
-      <w:r>
-        <w:rPr>
-          <w:b/>
-          <w:bCs/>
+          <w:rFonts w:ascii="Times New Roman" w:hAnsi="Times New Roman" w:cs="Times New Roman"/>
+          <w:b/>
+          <w:bCs/>
+          <w:sz w:val="24"/>
+          <w:szCs w:val="24"/>
+        </w:rPr>
+      </w:pPr>
+      <w:r>
+        <w:rPr>
+          <w:rFonts w:ascii="Times New Roman" w:hAnsi="Times New Roman" w:cs="Times New Roman"/>
+          <w:b/>
+          <w:bCs/>
+          <w:sz w:val="24"/>
+          <w:szCs w:val="24"/>
         </w:rPr>
         <w:t>Final Revised Vulnerability Management Policy</w:t>
       </w:r>
@@ -340,80 +653,152 @@
     <w:p>
       <w:pPr>
         <w:rPr>
-          <w:b/>
-          <w:bCs/>
-        </w:rPr>
-      </w:pPr>
-      <w:r>
-        <w:rPr>
-          <w:b/>
-          <w:bCs/>
+          <w:rFonts w:ascii="Times New Roman" w:hAnsi="Times New Roman" w:cs="Times New Roman"/>
+          <w:b/>
+          <w:bCs/>
+          <w:sz w:val="24"/>
+          <w:szCs w:val="24"/>
+        </w:rPr>
+      </w:pPr>
+      <w:r>
+        <w:rPr>
+          <w:rFonts w:ascii="Times New Roman" w:hAnsi="Times New Roman" w:cs="Times New Roman"/>
+          <w:b/>
+          <w:bCs/>
+          <w:sz w:val="24"/>
+          <w:szCs w:val="24"/>
         </w:rPr>
         <w:t>Purpose</w:t>
       </w:r>
     </w:p>
     <w:p>
-      <w:r>
+      <w:pPr>
+        <w:rPr>
+          <w:rFonts w:ascii="Times New Roman" w:hAnsi="Times New Roman" w:cs="Times New Roman"/>
+          <w:sz w:val="24"/>
+          <w:szCs w:val="24"/>
+        </w:rPr>
+      </w:pPr>
+      <w:r>
+        <w:rPr>
+          <w:rFonts w:ascii="Times New Roman" w:hAnsi="Times New Roman" w:cs="Times New Roman"/>
+          <w:sz w:val="24"/>
+          <w:szCs w:val="24"/>
+        </w:rPr>
         <w:t>This policy establishes a structured vulnerability management program to identify, assess, prioritize, remediate, and report security vulnerabilities in alignment with NIST SP 800-40 and ISO/IEC 27001 standards.</w:t>
       </w:r>
     </w:p>
     <w:p>
       <w:pPr>
         <w:rPr>
-          <w:b/>
-          <w:bCs/>
-        </w:rPr>
-      </w:pPr>
-      <w:r>
-        <w:rPr>
-          <w:b/>
-          <w:bCs/>
+          <w:rFonts w:ascii="Times New Roman" w:hAnsi="Times New Roman" w:cs="Times New Roman"/>
+          <w:b/>
+          <w:bCs/>
+          <w:sz w:val="24"/>
+          <w:szCs w:val="24"/>
+        </w:rPr>
+      </w:pPr>
+      <w:r>
+        <w:rPr>
+          <w:rFonts w:ascii="Times New Roman" w:hAnsi="Times New Roman" w:cs="Times New Roman"/>
+          <w:b/>
+          <w:bCs/>
+          <w:sz w:val="24"/>
+          <w:szCs w:val="24"/>
         </w:rPr>
         <w:t>Scope</w:t>
       </w:r>
     </w:p>
     <w:p>
-      <w:r>
+      <w:pPr>
+        <w:rPr>
+          <w:rFonts w:ascii="Times New Roman" w:hAnsi="Times New Roman" w:cs="Times New Roman"/>
+          <w:sz w:val="24"/>
+          <w:szCs w:val="24"/>
+        </w:rPr>
+      </w:pPr>
+      <w:r>
+        <w:rPr>
+          <w:rFonts w:ascii="Times New Roman" w:hAnsi="Times New Roman" w:cs="Times New Roman"/>
+          <w:sz w:val="24"/>
+          <w:szCs w:val="24"/>
+        </w:rPr>
         <w:t>This policy applies to all organizational information systems, including servers, endpoints, cloud services, applications, and network infrastructure.</w:t>
       </w:r>
     </w:p>
     <w:p>
       <w:pPr>
         <w:rPr>
-          <w:b/>
-          <w:bCs/>
-        </w:rPr>
-      </w:pPr>
-      <w:r>
-        <w:rPr>
-          <w:b/>
-          <w:bCs/>
+          <w:rFonts w:ascii="Times New Roman" w:hAnsi="Times New Roman" w:cs="Times New Roman"/>
+          <w:b/>
+          <w:bCs/>
+          <w:sz w:val="24"/>
+          <w:szCs w:val="24"/>
+        </w:rPr>
+      </w:pPr>
+      <w:r>
+        <w:rPr>
+          <w:rFonts w:ascii="Times New Roman" w:hAnsi="Times New Roman" w:cs="Times New Roman"/>
+          <w:b/>
+          <w:bCs/>
+          <w:sz w:val="24"/>
+          <w:szCs w:val="24"/>
         </w:rPr>
         <w:t>Vulnerability Identification</w:t>
       </w:r>
     </w:p>
     <w:p>
-      <w:r>
+      <w:pPr>
+        <w:rPr>
+          <w:rFonts w:ascii="Times New Roman" w:hAnsi="Times New Roman" w:cs="Times New Roman"/>
+          <w:sz w:val="24"/>
+          <w:szCs w:val="24"/>
+        </w:rPr>
+      </w:pPr>
+      <w:r>
+        <w:rPr>
+          <w:rFonts w:ascii="Times New Roman" w:hAnsi="Times New Roman" w:cs="Times New Roman"/>
+          <w:sz w:val="24"/>
+          <w:szCs w:val="24"/>
+        </w:rPr>
         <w:t>Vulnerability scans shall be conducted monthly at minimum. External-facing systems shall be scanned weekly. High-risk assets may be monitored continuously.</w:t>
       </w:r>
     </w:p>
     <w:p>
       <w:pPr>
         <w:rPr>
-          <w:b/>
-          <w:bCs/>
-        </w:rPr>
-      </w:pPr>
-      <w:r>
-        <w:rPr>
-          <w:b/>
-          <w:bCs/>
+          <w:rFonts w:ascii="Times New Roman" w:hAnsi="Times New Roman" w:cs="Times New Roman"/>
+          <w:b/>
+          <w:bCs/>
+          <w:sz w:val="24"/>
+          <w:szCs w:val="24"/>
+        </w:rPr>
+      </w:pPr>
+      <w:r>
+        <w:rPr>
+          <w:rFonts w:ascii="Times New Roman" w:hAnsi="Times New Roman" w:cs="Times New Roman"/>
+          <w:b/>
+          <w:bCs/>
+          <w:sz w:val="24"/>
+          <w:szCs w:val="24"/>
         </w:rPr>
         <w:t>Risk Classification</w:t>
       </w:r>
     </w:p>
     <w:p>
-      <w:r>
+      <w:pPr>
+        <w:rPr>
+          <w:rFonts w:ascii="Times New Roman" w:hAnsi="Times New Roman" w:cs="Times New Roman"/>
+          <w:sz w:val="24"/>
+          <w:szCs w:val="24"/>
+        </w:rPr>
+      </w:pPr>
+      <w:r>
+        <w:rPr>
+          <w:rFonts w:ascii="Times New Roman" w:hAnsi="Times New Roman" w:cs="Times New Roman"/>
+          <w:sz w:val="24"/>
+          <w:szCs w:val="24"/>
+        </w:rPr>
         <w:t>Vulnerabilities shall be classified using the Common Vulnerability Scoring System (CVSS v3.1):</w:t>
       </w:r>
     </w:p>
@@ -423,8 +808,18 @@
           <w:ilvl w:val="0"/>
           <w:numId w:val="2"/>
         </w:numPr>
-      </w:pPr>
-      <w:r>
+        <w:rPr>
+          <w:rFonts w:ascii="Times New Roman" w:hAnsi="Times New Roman" w:cs="Times New Roman"/>
+          <w:sz w:val="24"/>
+          <w:szCs w:val="24"/>
+        </w:rPr>
+      </w:pPr>
+      <w:r>
+        <w:rPr>
+          <w:rFonts w:ascii="Times New Roman" w:hAnsi="Times New Roman" w:cs="Times New Roman"/>
+          <w:sz w:val="24"/>
+          <w:szCs w:val="24"/>
+        </w:rPr>
         <w:t>Critical (9.0–10.0)</w:t>
       </w:r>
     </w:p>
@@ -434,8 +829,18 @@
           <w:ilvl w:val="0"/>
           <w:numId w:val="2"/>
         </w:numPr>
-      </w:pPr>
-      <w:r>
+        <w:rPr>
+          <w:rFonts w:ascii="Times New Roman" w:hAnsi="Times New Roman" w:cs="Times New Roman"/>
+          <w:sz w:val="24"/>
+          <w:szCs w:val="24"/>
+        </w:rPr>
+      </w:pPr>
+      <w:r>
+        <w:rPr>
+          <w:rFonts w:ascii="Times New Roman" w:hAnsi="Times New Roman" w:cs="Times New Roman"/>
+          <w:sz w:val="24"/>
+          <w:szCs w:val="24"/>
+        </w:rPr>
         <w:t>High (7.0–8.9)</w:t>
       </w:r>
     </w:p>
@@ -445,8 +850,18 @@
           <w:ilvl w:val="0"/>
           <w:numId w:val="2"/>
         </w:numPr>
-      </w:pPr>
-      <w:r>
+        <w:rPr>
+          <w:rFonts w:ascii="Times New Roman" w:hAnsi="Times New Roman" w:cs="Times New Roman"/>
+          <w:sz w:val="24"/>
+          <w:szCs w:val="24"/>
+        </w:rPr>
+      </w:pPr>
+      <w:r>
+        <w:rPr>
+          <w:rFonts w:ascii="Times New Roman" w:hAnsi="Times New Roman" w:cs="Times New Roman"/>
+          <w:sz w:val="24"/>
+          <w:szCs w:val="24"/>
+        </w:rPr>
         <w:t>Medium (4.0–6.9)</w:t>
       </w:r>
     </w:p>
@@ -456,72 +871,155 @@
           <w:ilvl w:val="0"/>
           <w:numId w:val="2"/>
         </w:numPr>
-      </w:pPr>
-      <w:r>
+        <w:rPr>
+          <w:rFonts w:ascii="Times New Roman" w:hAnsi="Times New Roman" w:cs="Times New Roman"/>
+          <w:sz w:val="24"/>
+          <w:szCs w:val="24"/>
+        </w:rPr>
+      </w:pPr>
+      <w:r>
+        <w:rPr>
+          <w:rFonts w:ascii="Times New Roman" w:hAnsi="Times New Roman" w:cs="Times New Roman"/>
+          <w:sz w:val="24"/>
+          <w:szCs w:val="24"/>
+        </w:rPr>
         <w:t>Low (0.1–3.9)</w:t>
       </w:r>
     </w:p>
     <w:p>
       <w:pPr>
         <w:rPr>
-          <w:b/>
-          <w:bCs/>
-        </w:rPr>
-      </w:pPr>
-      <w:r>
-        <w:rPr>
-          <w:b/>
-          <w:bCs/>
+          <w:rFonts w:ascii="Times New Roman" w:hAnsi="Times New Roman" w:cs="Times New Roman"/>
+          <w:b/>
+          <w:bCs/>
+          <w:sz w:val="24"/>
+          <w:szCs w:val="24"/>
+        </w:rPr>
+      </w:pPr>
+      <w:r>
+        <w:rPr>
+          <w:rFonts w:ascii="Times New Roman" w:hAnsi="Times New Roman" w:cs="Times New Roman"/>
+          <w:b/>
+          <w:bCs/>
+          <w:sz w:val="24"/>
+          <w:szCs w:val="24"/>
         </w:rPr>
         <w:t>Remediation Timelines</w:t>
       </w:r>
     </w:p>
     <w:p>
-      <w:r>
+      <w:pPr>
+        <w:rPr>
+          <w:rFonts w:ascii="Times New Roman" w:hAnsi="Times New Roman" w:cs="Times New Roman"/>
+          <w:sz w:val="24"/>
+          <w:szCs w:val="24"/>
+        </w:rPr>
+      </w:pPr>
+      <w:r>
+        <w:rPr>
+          <w:rFonts w:ascii="Times New Roman" w:hAnsi="Times New Roman" w:cs="Times New Roman"/>
+          <w:sz w:val="24"/>
+          <w:szCs w:val="24"/>
+        </w:rPr>
         <w:t>Critical vulnerabilities must be remediated within 72 hours.</w:t>
       </w:r>
       <w:r>
+        <w:rPr>
+          <w:rFonts w:ascii="Times New Roman" w:hAnsi="Times New Roman" w:cs="Times New Roman"/>
+          <w:sz w:val="24"/>
+          <w:szCs w:val="24"/>
+        </w:rPr>
         <w:br/>
         <w:t>High vulnerabilities must be remediated within 7 days.</w:t>
       </w:r>
       <w:r>
+        <w:rPr>
+          <w:rFonts w:ascii="Times New Roman" w:hAnsi="Times New Roman" w:cs="Times New Roman"/>
+          <w:sz w:val="24"/>
+          <w:szCs w:val="24"/>
+        </w:rPr>
         <w:br/>
         <w:t>Medium vulnerabilities must be remediated within 30 days.</w:t>
       </w:r>
       <w:r>
+        <w:rPr>
+          <w:rFonts w:ascii="Times New Roman" w:hAnsi="Times New Roman" w:cs="Times New Roman"/>
+          <w:sz w:val="24"/>
+          <w:szCs w:val="24"/>
+        </w:rPr>
         <w:br/>
         <w:t>Low vulnerabilities must be remediated within 90 days.</w:t>
       </w:r>
     </w:p>
     <w:p>
-      <w:r>
+      <w:pPr>
+        <w:rPr>
+          <w:rFonts w:ascii="Times New Roman" w:hAnsi="Times New Roman" w:cs="Times New Roman"/>
+          <w:sz w:val="24"/>
+          <w:szCs w:val="24"/>
+        </w:rPr>
+      </w:pPr>
+      <w:r>
+        <w:rPr>
+          <w:rFonts w:ascii="Times New Roman" w:hAnsi="Times New Roman" w:cs="Times New Roman"/>
+          <w:sz w:val="24"/>
+          <w:szCs w:val="24"/>
+        </w:rPr>
         <w:t>Exceptions must be documented and approved by executive leadership.</w:t>
       </w:r>
     </w:p>
     <w:p>
       <w:pPr>
         <w:rPr>
-          <w:b/>
-          <w:bCs/>
-        </w:rPr>
-      </w:pPr>
-      <w:r>
-        <w:rPr>
-          <w:b/>
-          <w:bCs/>
+          <w:rFonts w:ascii="Times New Roman" w:hAnsi="Times New Roman" w:cs="Times New Roman"/>
+          <w:b/>
+          <w:bCs/>
+          <w:sz w:val="24"/>
+          <w:szCs w:val="24"/>
+        </w:rPr>
+      </w:pPr>
+      <w:r>
+        <w:rPr>
+          <w:rFonts w:ascii="Times New Roman" w:hAnsi="Times New Roman" w:cs="Times New Roman"/>
+          <w:b/>
+          <w:bCs/>
+          <w:sz w:val="24"/>
+          <w:szCs w:val="24"/>
         </w:rPr>
         <w:t>Roles and Responsibilities</w:t>
       </w:r>
     </w:p>
     <w:p>
-      <w:r>
+      <w:pPr>
+        <w:rPr>
+          <w:rFonts w:ascii="Times New Roman" w:hAnsi="Times New Roman" w:cs="Times New Roman"/>
+          <w:sz w:val="24"/>
+          <w:szCs w:val="24"/>
+        </w:rPr>
+      </w:pPr>
+      <w:r>
+        <w:rPr>
+          <w:rFonts w:ascii="Times New Roman" w:hAnsi="Times New Roman" w:cs="Times New Roman"/>
+          <w:sz w:val="24"/>
+          <w:szCs w:val="24"/>
+        </w:rPr>
         <w:t>The Security Team is responsible for conducting scans and tracking remediation efforts.</w:t>
       </w:r>
       <w:r>
+        <w:rPr>
+          <w:rFonts w:ascii="Times New Roman" w:hAnsi="Times New Roman" w:cs="Times New Roman"/>
+          <w:sz w:val="24"/>
+          <w:szCs w:val="24"/>
+        </w:rPr>
         <w:br/>
         <w:t>System Owners are responsible for applying corrective actions.</w:t>
       </w:r>
       <w:r>
+        <w:rPr>
+          <w:rFonts w:ascii="Times New Roman" w:hAnsi="Times New Roman" w:cs="Times New Roman"/>
+          <w:sz w:val="24"/>
+          <w:szCs w:val="24"/>
+        </w:rPr>
         <w:br/>
         <w:t>Executive Leadership provides oversight and resource allocation.</w:t>
       </w:r>
@@ -529,42 +1027,88 @@
     <w:p>
       <w:pPr>
         <w:rPr>
-          <w:b/>
-          <w:bCs/>
-        </w:rPr>
-      </w:pPr>
-      <w:r>
-        <w:rPr>
-          <w:b/>
-          <w:bCs/>
+          <w:rFonts w:ascii="Times New Roman" w:hAnsi="Times New Roman" w:cs="Times New Roman"/>
+          <w:b/>
+          <w:bCs/>
+          <w:sz w:val="24"/>
+          <w:szCs w:val="24"/>
+        </w:rPr>
+      </w:pPr>
+      <w:r>
+        <w:rPr>
+          <w:rFonts w:ascii="Times New Roman" w:hAnsi="Times New Roman" w:cs="Times New Roman"/>
+          <w:b/>
+          <w:bCs/>
+          <w:sz w:val="24"/>
+          <w:szCs w:val="24"/>
         </w:rPr>
         <w:t>Reporting and Review</w:t>
       </w:r>
     </w:p>
     <w:p>
-      <w:r>
+      <w:pPr>
+        <w:rPr>
+          <w:rFonts w:ascii="Times New Roman" w:hAnsi="Times New Roman" w:cs="Times New Roman"/>
+          <w:sz w:val="24"/>
+          <w:szCs w:val="24"/>
+        </w:rPr>
+      </w:pPr>
+      <w:r>
+        <w:rPr>
+          <w:rFonts w:ascii="Times New Roman" w:hAnsi="Times New Roman" w:cs="Times New Roman"/>
+          <w:sz w:val="24"/>
+          <w:szCs w:val="24"/>
+        </w:rPr>
         <w:t>Monthly vulnerability reports shall be submitted to executive leadership. This policy will be reviewed annually.</w:t>
       </w:r>
     </w:p>
     <w:p>
-      <w:r>
+      <w:pPr>
+        <w:rPr>
+          <w:rFonts w:ascii="Times New Roman" w:hAnsi="Times New Roman" w:cs="Times New Roman"/>
+          <w:sz w:val="24"/>
+          <w:szCs w:val="24"/>
+        </w:rPr>
+      </w:pPr>
+      <w:r>
+        <w:rPr>
+          <w:rFonts w:ascii="Times New Roman" w:hAnsi="Times New Roman" w:cs="Times New Roman"/>
+          <w:sz w:val="24"/>
+          <w:szCs w:val="24"/>
+        </w:rPr>
         <w:pict w14:anchorId="52B1CEEC">
-          <v:rect id="_x0000_i1082" style="width:0;height:1.5pt" o:hralign="center" o:hrstd="t" o:hr="t" fillcolor="#a0a0a0" stroked="f"/>
+          <v:rect id="_x0000_i1028" style="width:0;height:1.5pt" o:hralign="center" o:hrstd="t" o:hr="t" fillcolor="#a0a0a0" stroked="f"/>
         </w:pict>
       </w:r>
     </w:p>
     <w:p>
-      <w:r>
+      <w:pPr>
+        <w:rPr>
+          <w:rFonts w:ascii="Times New Roman" w:hAnsi="Times New Roman" w:cs="Times New Roman"/>
+          <w:sz w:val="24"/>
+          <w:szCs w:val="24"/>
+        </w:rPr>
+      </w:pPr>
+      <w:r>
+        <w:rPr>
+          <w:rFonts w:ascii="Times New Roman" w:hAnsi="Times New Roman" w:cs="Times New Roman"/>
+          <w:sz w:val="24"/>
+          <w:szCs w:val="24"/>
+        </w:rPr>
+        <w:lastRenderedPageBreak/>
         <w:pict w14:anchorId="0A5C09FB">
-          <v:rect id="_x0000_i1083" style="width:0;height:1.5pt" o:hralign="center" o:hrstd="t" o:hr="t" fillcolor="#a0a0a0" stroked="f"/>
+          <v:rect id="_x0000_i1029" style="width:0;height:1.5pt" o:hralign="center" o:hrstd="t" o:hr="t" fillcolor="#a0a0a0" stroked="f"/>
         </w:pict>
       </w:r>
     </w:p>
     <w:p>
       <w:pPr>
         <w:rPr>
-          <w:b/>
-          <w:bCs/>
+          <w:rFonts w:ascii="Times New Roman" w:hAnsi="Times New Roman" w:cs="Times New Roman"/>
+          <w:b/>
+          <w:bCs/>
+          <w:sz w:val="24"/>
+          <w:szCs w:val="24"/>
         </w:rPr>
       </w:pPr>
       <w:r>
@@ -572,30 +1116,40 @@
           <w:rFonts w:ascii="Segoe UI Emoji" w:hAnsi="Segoe UI Emoji" w:cs="Segoe UI Emoji"/>
           <w:b/>
           <w:bCs/>
-        </w:rPr>
-        <w:lastRenderedPageBreak/>
+          <w:sz w:val="24"/>
+          <w:szCs w:val="24"/>
+        </w:rPr>
         <w:t>📄</w:t>
       </w:r>
       <w:r>
         <w:rPr>
-          <w:b/>
-          <w:bCs/>
+          <w:rFonts w:ascii="Times New Roman" w:hAnsi="Times New Roman" w:cs="Times New Roman"/>
+          <w:b/>
+          <w:bCs/>
+          <w:sz w:val="24"/>
+          <w:szCs w:val="24"/>
         </w:rPr>
         <w:t xml:space="preserve"> Patch Management Policy </w:t>
       </w:r>
       <w:proofErr w:type="gramStart"/>
       <w:r>
         <w:rPr>
-          <w:b/>
-          <w:bCs/>
+          <w:rFonts w:ascii="Times New Roman" w:hAnsi="Times New Roman" w:cs="Times New Roman"/>
+          <w:b/>
+          <w:bCs/>
+          <w:sz w:val="24"/>
+          <w:szCs w:val="24"/>
         </w:rPr>
         <w:t>With</w:t>
       </w:r>
       <w:proofErr w:type="gramEnd"/>
       <w:r>
         <w:rPr>
-          <w:b/>
-          <w:bCs/>
+          <w:rFonts w:ascii="Times New Roman" w:hAnsi="Times New Roman" w:cs="Times New Roman"/>
+          <w:b/>
+          <w:bCs/>
+          <w:sz w:val="24"/>
+          <w:szCs w:val="24"/>
         </w:rPr>
         <w:t xml:space="preserve"> AI Critique</w:t>
       </w:r>
@@ -603,14 +1157,20 @@
     <w:p>
       <w:pPr>
         <w:rPr>
-          <w:b/>
-          <w:bCs/>
-        </w:rPr>
-      </w:pPr>
-      <w:r>
-        <w:rPr>
-          <w:b/>
-          <w:bCs/>
+          <w:rFonts w:ascii="Times New Roman" w:hAnsi="Times New Roman" w:cs="Times New Roman"/>
+          <w:b/>
+          <w:bCs/>
+          <w:sz w:val="24"/>
+          <w:szCs w:val="24"/>
+        </w:rPr>
+      </w:pPr>
+      <w:r>
+        <w:rPr>
+          <w:rFonts w:ascii="Times New Roman" w:hAnsi="Times New Roman" w:cs="Times New Roman"/>
+          <w:b/>
+          <w:bCs/>
+          <w:sz w:val="24"/>
+          <w:szCs w:val="24"/>
         </w:rPr>
         <w:t>AI-Generated Draft: Patch Management Policy</w:t>
       </w:r>
@@ -618,107 +1178,209 @@
     <w:p>
       <w:pPr>
         <w:rPr>
-          <w:b/>
-          <w:bCs/>
-        </w:rPr>
-      </w:pPr>
-      <w:r>
-        <w:rPr>
-          <w:b/>
-          <w:bCs/>
+          <w:rFonts w:ascii="Times New Roman" w:hAnsi="Times New Roman" w:cs="Times New Roman"/>
+          <w:b/>
+          <w:bCs/>
+          <w:sz w:val="24"/>
+          <w:szCs w:val="24"/>
+        </w:rPr>
+      </w:pPr>
+      <w:r>
+        <w:rPr>
+          <w:rFonts w:ascii="Times New Roman" w:hAnsi="Times New Roman" w:cs="Times New Roman"/>
+          <w:b/>
+          <w:bCs/>
+          <w:sz w:val="24"/>
+          <w:szCs w:val="24"/>
         </w:rPr>
         <w:t>Purpose</w:t>
       </w:r>
     </w:p>
     <w:p>
-      <w:r>
+      <w:pPr>
+        <w:rPr>
+          <w:rFonts w:ascii="Times New Roman" w:hAnsi="Times New Roman" w:cs="Times New Roman"/>
+          <w:sz w:val="24"/>
+          <w:szCs w:val="24"/>
+        </w:rPr>
+      </w:pPr>
+      <w:r>
+        <w:rPr>
+          <w:rFonts w:ascii="Times New Roman" w:hAnsi="Times New Roman" w:cs="Times New Roman"/>
+          <w:sz w:val="24"/>
+          <w:szCs w:val="24"/>
+        </w:rPr>
         <w:t>The purpose of this policy is to ensure that systems are updated regularly with patches to reduce security vulnerabilities.</w:t>
       </w:r>
     </w:p>
     <w:p>
       <w:pPr>
         <w:rPr>
-          <w:b/>
-          <w:bCs/>
-        </w:rPr>
-      </w:pPr>
-      <w:r>
-        <w:rPr>
-          <w:b/>
-          <w:bCs/>
+          <w:rFonts w:ascii="Times New Roman" w:hAnsi="Times New Roman" w:cs="Times New Roman"/>
+          <w:b/>
+          <w:bCs/>
+          <w:sz w:val="24"/>
+          <w:szCs w:val="24"/>
+        </w:rPr>
+      </w:pPr>
+      <w:r>
+        <w:rPr>
+          <w:rFonts w:ascii="Times New Roman" w:hAnsi="Times New Roman" w:cs="Times New Roman"/>
+          <w:b/>
+          <w:bCs/>
+          <w:sz w:val="24"/>
+          <w:szCs w:val="24"/>
         </w:rPr>
         <w:t>Scope</w:t>
       </w:r>
     </w:p>
     <w:p>
-      <w:r>
+      <w:pPr>
+        <w:rPr>
+          <w:rFonts w:ascii="Times New Roman" w:hAnsi="Times New Roman" w:cs="Times New Roman"/>
+          <w:sz w:val="24"/>
+          <w:szCs w:val="24"/>
+        </w:rPr>
+      </w:pPr>
+      <w:r>
+        <w:rPr>
+          <w:rFonts w:ascii="Times New Roman" w:hAnsi="Times New Roman" w:cs="Times New Roman"/>
+          <w:sz w:val="24"/>
+          <w:szCs w:val="24"/>
+        </w:rPr>
         <w:t>This policy applies to all organizational systems.</w:t>
       </w:r>
     </w:p>
     <w:p>
       <w:pPr>
         <w:rPr>
-          <w:b/>
-          <w:bCs/>
-        </w:rPr>
-      </w:pPr>
-      <w:r>
-        <w:rPr>
-          <w:b/>
-          <w:bCs/>
+          <w:rFonts w:ascii="Times New Roman" w:hAnsi="Times New Roman" w:cs="Times New Roman"/>
+          <w:b/>
+          <w:bCs/>
+          <w:sz w:val="24"/>
+          <w:szCs w:val="24"/>
+        </w:rPr>
+      </w:pPr>
+      <w:r>
+        <w:rPr>
+          <w:rFonts w:ascii="Times New Roman" w:hAnsi="Times New Roman" w:cs="Times New Roman"/>
+          <w:b/>
+          <w:bCs/>
+          <w:sz w:val="24"/>
+          <w:szCs w:val="24"/>
         </w:rPr>
         <w:t>Policy Statement</w:t>
       </w:r>
     </w:p>
     <w:p>
-      <w:r>
+      <w:pPr>
+        <w:rPr>
+          <w:rFonts w:ascii="Times New Roman" w:hAnsi="Times New Roman" w:cs="Times New Roman"/>
+          <w:sz w:val="24"/>
+          <w:szCs w:val="24"/>
+        </w:rPr>
+      </w:pPr>
+      <w:r>
+        <w:rPr>
+          <w:rFonts w:ascii="Times New Roman" w:hAnsi="Times New Roman" w:cs="Times New Roman"/>
+          <w:sz w:val="24"/>
+          <w:szCs w:val="24"/>
+        </w:rPr>
         <w:t>Patches will be applied regularly, and critical patches will be prioritized.</w:t>
       </w:r>
     </w:p>
     <w:p>
       <w:pPr>
         <w:rPr>
-          <w:b/>
-          <w:bCs/>
-        </w:rPr>
-      </w:pPr>
-      <w:r>
-        <w:rPr>
-          <w:b/>
-          <w:bCs/>
+          <w:rFonts w:ascii="Times New Roman" w:hAnsi="Times New Roman" w:cs="Times New Roman"/>
+          <w:b/>
+          <w:bCs/>
+          <w:sz w:val="24"/>
+          <w:szCs w:val="24"/>
+        </w:rPr>
+      </w:pPr>
+      <w:r>
+        <w:rPr>
+          <w:rFonts w:ascii="Times New Roman" w:hAnsi="Times New Roman" w:cs="Times New Roman"/>
+          <w:b/>
+          <w:bCs/>
+          <w:sz w:val="24"/>
+          <w:szCs w:val="24"/>
         </w:rPr>
         <w:t>Review</w:t>
       </w:r>
     </w:p>
     <w:p>
-      <w:r>
+      <w:pPr>
+        <w:rPr>
+          <w:rFonts w:ascii="Times New Roman" w:hAnsi="Times New Roman" w:cs="Times New Roman"/>
+          <w:sz w:val="24"/>
+          <w:szCs w:val="24"/>
+        </w:rPr>
+      </w:pPr>
+      <w:r>
+        <w:rPr>
+          <w:rFonts w:ascii="Times New Roman" w:hAnsi="Times New Roman" w:cs="Times New Roman"/>
+          <w:sz w:val="24"/>
+          <w:szCs w:val="24"/>
+        </w:rPr>
         <w:t>This policy will be reviewed annually.</w:t>
       </w:r>
     </w:p>
     <w:p>
-      <w:r>
+      <w:pPr>
+        <w:rPr>
+          <w:rFonts w:ascii="Times New Roman" w:hAnsi="Times New Roman" w:cs="Times New Roman"/>
+          <w:sz w:val="24"/>
+          <w:szCs w:val="24"/>
+        </w:rPr>
+      </w:pPr>
+      <w:r>
+        <w:rPr>
+          <w:rFonts w:ascii="Times New Roman" w:hAnsi="Times New Roman" w:cs="Times New Roman"/>
+          <w:sz w:val="24"/>
+          <w:szCs w:val="24"/>
+        </w:rPr>
         <w:pict w14:anchorId="07F79849">
-          <v:rect id="_x0000_i1084" style="width:0;height:1.5pt" o:hralign="center" o:hrstd="t" o:hr="t" fillcolor="#a0a0a0" stroked="f"/>
+          <v:rect id="_x0000_i1030" style="width:0;height:1.5pt" o:hralign="center" o:hrstd="t" o:hr="t" fillcolor="#a0a0a0" stroked="f"/>
         </w:pict>
       </w:r>
     </w:p>
     <w:p>
       <w:pPr>
         <w:rPr>
-          <w:b/>
-          <w:bCs/>
-        </w:rPr>
-      </w:pPr>
-      <w:r>
-        <w:rPr>
-          <w:b/>
-          <w:bCs/>
+          <w:rFonts w:ascii="Times New Roman" w:hAnsi="Times New Roman" w:cs="Times New Roman"/>
+          <w:b/>
+          <w:bCs/>
+          <w:sz w:val="24"/>
+          <w:szCs w:val="24"/>
+        </w:rPr>
+      </w:pPr>
+      <w:r>
+        <w:rPr>
+          <w:rFonts w:ascii="Times New Roman" w:hAnsi="Times New Roman" w:cs="Times New Roman"/>
+          <w:b/>
+          <w:bCs/>
+          <w:sz w:val="24"/>
+          <w:szCs w:val="24"/>
         </w:rPr>
         <w:t>AI Critique and Annotations</w:t>
       </w:r>
     </w:p>
     <w:p>
-      <w:r>
+      <w:pPr>
+        <w:rPr>
+          <w:rFonts w:ascii="Times New Roman" w:hAnsi="Times New Roman" w:cs="Times New Roman"/>
+          <w:sz w:val="24"/>
+          <w:szCs w:val="24"/>
+        </w:rPr>
+      </w:pPr>
+      <w:r>
+        <w:rPr>
+          <w:rFonts w:ascii="Times New Roman" w:hAnsi="Times New Roman" w:cs="Times New Roman"/>
+          <w:sz w:val="24"/>
+          <w:szCs w:val="24"/>
+        </w:rPr>
         <w:t>The AI-generated draft lacked procedural depth and operational clarity. The following issues were identified:</w:t>
       </w:r>
     </w:p>
@@ -728,8 +1390,18 @@
           <w:ilvl w:val="0"/>
           <w:numId w:val="3"/>
         </w:numPr>
-      </w:pPr>
-      <w:r>
+        <w:rPr>
+          <w:rFonts w:ascii="Times New Roman" w:hAnsi="Times New Roman" w:cs="Times New Roman"/>
+          <w:sz w:val="24"/>
+          <w:szCs w:val="24"/>
+        </w:rPr>
+      </w:pPr>
+      <w:r>
+        <w:rPr>
+          <w:rFonts w:ascii="Times New Roman" w:hAnsi="Times New Roman" w:cs="Times New Roman"/>
+          <w:sz w:val="24"/>
+          <w:szCs w:val="24"/>
+        </w:rPr>
         <w:t>No defined patch testing process.</w:t>
       </w:r>
     </w:p>
@@ -739,8 +1411,18 @@
           <w:ilvl w:val="0"/>
           <w:numId w:val="3"/>
         </w:numPr>
-      </w:pPr>
-      <w:r>
+        <w:rPr>
+          <w:rFonts w:ascii="Times New Roman" w:hAnsi="Times New Roman" w:cs="Times New Roman"/>
+          <w:sz w:val="24"/>
+          <w:szCs w:val="24"/>
+        </w:rPr>
+      </w:pPr>
+      <w:r>
+        <w:rPr>
+          <w:rFonts w:ascii="Times New Roman" w:hAnsi="Times New Roman" w:cs="Times New Roman"/>
+          <w:sz w:val="24"/>
+          <w:szCs w:val="24"/>
+        </w:rPr>
         <w:t>No emergency patch deployment procedure.</w:t>
       </w:r>
     </w:p>
@@ -750,8 +1432,18 @@
           <w:ilvl w:val="0"/>
           <w:numId w:val="3"/>
         </w:numPr>
-      </w:pPr>
-      <w:r>
+        <w:rPr>
+          <w:rFonts w:ascii="Times New Roman" w:hAnsi="Times New Roman" w:cs="Times New Roman"/>
+          <w:sz w:val="24"/>
+          <w:szCs w:val="24"/>
+        </w:rPr>
+      </w:pPr>
+      <w:r>
+        <w:rPr>
+          <w:rFonts w:ascii="Times New Roman" w:hAnsi="Times New Roman" w:cs="Times New Roman"/>
+          <w:sz w:val="24"/>
+          <w:szCs w:val="24"/>
+        </w:rPr>
         <w:t>No integration with change management controls.</w:t>
       </w:r>
     </w:p>
@@ -761,8 +1453,18 @@
           <w:ilvl w:val="0"/>
           <w:numId w:val="3"/>
         </w:numPr>
-      </w:pPr>
-      <w:r>
+        <w:rPr>
+          <w:rFonts w:ascii="Times New Roman" w:hAnsi="Times New Roman" w:cs="Times New Roman"/>
+          <w:sz w:val="24"/>
+          <w:szCs w:val="24"/>
+        </w:rPr>
+      </w:pPr>
+      <w:r>
+        <w:rPr>
+          <w:rFonts w:ascii="Times New Roman" w:hAnsi="Times New Roman" w:cs="Times New Roman"/>
+          <w:sz w:val="24"/>
+          <w:szCs w:val="24"/>
+        </w:rPr>
         <w:t>No severity-based deployment timelines.</w:t>
       </w:r>
     </w:p>
@@ -772,34 +1474,74 @@
           <w:ilvl w:val="0"/>
           <w:numId w:val="3"/>
         </w:numPr>
-      </w:pPr>
-      <w:r>
+        <w:rPr>
+          <w:rFonts w:ascii="Times New Roman" w:hAnsi="Times New Roman" w:cs="Times New Roman"/>
+          <w:sz w:val="24"/>
+          <w:szCs w:val="24"/>
+        </w:rPr>
+      </w:pPr>
+      <w:r>
+        <w:rPr>
+          <w:rFonts w:ascii="Times New Roman" w:hAnsi="Times New Roman" w:cs="Times New Roman"/>
+          <w:sz w:val="24"/>
+          <w:szCs w:val="24"/>
+        </w:rPr>
         <w:t>No compliance framework alignment.</w:t>
       </w:r>
     </w:p>
     <w:p>
-      <w:r>
+      <w:pPr>
+        <w:rPr>
+          <w:rFonts w:ascii="Times New Roman" w:hAnsi="Times New Roman" w:cs="Times New Roman"/>
+          <w:sz w:val="24"/>
+          <w:szCs w:val="24"/>
+        </w:rPr>
+      </w:pPr>
+      <w:r>
+        <w:rPr>
+          <w:rFonts w:ascii="Times New Roman" w:hAnsi="Times New Roman" w:cs="Times New Roman"/>
+          <w:sz w:val="24"/>
+          <w:szCs w:val="24"/>
+        </w:rPr>
         <w:t>These limitations were corrected in the revised version.</w:t>
       </w:r>
     </w:p>
     <w:p>
-      <w:r>
+      <w:pPr>
+        <w:rPr>
+          <w:rFonts w:ascii="Times New Roman" w:hAnsi="Times New Roman" w:cs="Times New Roman"/>
+          <w:sz w:val="24"/>
+          <w:szCs w:val="24"/>
+        </w:rPr>
+      </w:pPr>
+      <w:r>
+        <w:rPr>
+          <w:rFonts w:ascii="Times New Roman" w:hAnsi="Times New Roman" w:cs="Times New Roman"/>
+          <w:sz w:val="24"/>
+          <w:szCs w:val="24"/>
+        </w:rPr>
         <w:pict w14:anchorId="4099E18A">
-          <v:rect id="_x0000_i1085" style="width:0;height:1.5pt" o:hralign="center" o:hrstd="t" o:hr="t" fillcolor="#a0a0a0" stroked="f"/>
+          <v:rect id="_x0000_i1031" style="width:0;height:1.5pt" o:hralign="center" o:hrstd="t" o:hr="t" fillcolor="#a0a0a0" stroked="f"/>
         </w:pict>
       </w:r>
     </w:p>
     <w:p>
       <w:pPr>
         <w:rPr>
-          <w:b/>
-          <w:bCs/>
-        </w:rPr>
-      </w:pPr>
-      <w:r>
-        <w:rPr>
-          <w:b/>
-          <w:bCs/>
+          <w:rFonts w:ascii="Times New Roman" w:hAnsi="Times New Roman" w:cs="Times New Roman"/>
+          <w:b/>
+          <w:bCs/>
+          <w:sz w:val="24"/>
+          <w:szCs w:val="24"/>
+        </w:rPr>
+      </w:pPr>
+      <w:r>
+        <w:rPr>
+          <w:rFonts w:ascii="Times New Roman" w:hAnsi="Times New Roman" w:cs="Times New Roman"/>
+          <w:b/>
+          <w:bCs/>
+          <w:sz w:val="24"/>
+          <w:szCs w:val="24"/>
         </w:rPr>
         <w:t>Final Revised Patch Management Policy</w:t>
       </w:r>
@@ -807,92 +1549,179 @@
     <w:p>
       <w:pPr>
         <w:rPr>
-          <w:b/>
-          <w:bCs/>
-        </w:rPr>
-      </w:pPr>
-      <w:r>
-        <w:rPr>
-          <w:b/>
-          <w:bCs/>
+          <w:rFonts w:ascii="Times New Roman" w:hAnsi="Times New Roman" w:cs="Times New Roman"/>
+          <w:b/>
+          <w:bCs/>
+          <w:sz w:val="24"/>
+          <w:szCs w:val="24"/>
+        </w:rPr>
+      </w:pPr>
+      <w:r>
+        <w:rPr>
+          <w:rFonts w:ascii="Times New Roman" w:hAnsi="Times New Roman" w:cs="Times New Roman"/>
+          <w:b/>
+          <w:bCs/>
+          <w:sz w:val="24"/>
+          <w:szCs w:val="24"/>
         </w:rPr>
         <w:t>Purpose</w:t>
       </w:r>
     </w:p>
     <w:p>
-      <w:r>
+      <w:pPr>
+        <w:rPr>
+          <w:rFonts w:ascii="Times New Roman" w:hAnsi="Times New Roman" w:cs="Times New Roman"/>
+          <w:sz w:val="24"/>
+          <w:szCs w:val="24"/>
+        </w:rPr>
+      </w:pPr>
+      <w:r>
+        <w:rPr>
+          <w:rFonts w:ascii="Times New Roman" w:hAnsi="Times New Roman" w:cs="Times New Roman"/>
+          <w:sz w:val="24"/>
+          <w:szCs w:val="24"/>
+        </w:rPr>
         <w:t>This policy establishes standardized procedures for evaluating, testing, approving, and deploying software patches in alignment with NIST SP 800-40 and CIS Control 7.</w:t>
       </w:r>
     </w:p>
     <w:p>
       <w:pPr>
         <w:rPr>
-          <w:b/>
-          <w:bCs/>
-        </w:rPr>
-      </w:pPr>
-      <w:r>
-        <w:rPr>
-          <w:b/>
-          <w:bCs/>
+          <w:rFonts w:ascii="Times New Roman" w:hAnsi="Times New Roman" w:cs="Times New Roman"/>
+          <w:b/>
+          <w:bCs/>
+          <w:sz w:val="24"/>
+          <w:szCs w:val="24"/>
+        </w:rPr>
+      </w:pPr>
+      <w:r>
+        <w:rPr>
+          <w:rFonts w:ascii="Times New Roman" w:hAnsi="Times New Roman" w:cs="Times New Roman"/>
+          <w:b/>
+          <w:bCs/>
+          <w:sz w:val="24"/>
+          <w:szCs w:val="24"/>
         </w:rPr>
         <w:t>Scope</w:t>
       </w:r>
     </w:p>
     <w:p>
-      <w:r>
+      <w:pPr>
+        <w:rPr>
+          <w:rFonts w:ascii="Times New Roman" w:hAnsi="Times New Roman" w:cs="Times New Roman"/>
+          <w:sz w:val="24"/>
+          <w:szCs w:val="24"/>
+        </w:rPr>
+      </w:pPr>
+      <w:r>
+        <w:rPr>
+          <w:rFonts w:ascii="Times New Roman" w:hAnsi="Times New Roman" w:cs="Times New Roman"/>
+          <w:sz w:val="24"/>
+          <w:szCs w:val="24"/>
+        </w:rPr>
         <w:t>This policy applies to all servers, endpoints, cloud systems, applications, and network devices managed by the organization.</w:t>
       </w:r>
     </w:p>
     <w:p>
       <w:pPr>
         <w:rPr>
-          <w:b/>
-          <w:bCs/>
-        </w:rPr>
-      </w:pPr>
-      <w:r>
-        <w:rPr>
-          <w:b/>
-          <w:bCs/>
+          <w:rFonts w:ascii="Times New Roman" w:hAnsi="Times New Roman" w:cs="Times New Roman"/>
+          <w:b/>
+          <w:bCs/>
+          <w:sz w:val="24"/>
+          <w:szCs w:val="24"/>
+        </w:rPr>
+      </w:pPr>
+      <w:r>
+        <w:rPr>
+          <w:rFonts w:ascii="Times New Roman" w:hAnsi="Times New Roman" w:cs="Times New Roman"/>
+          <w:b/>
+          <w:bCs/>
+          <w:sz w:val="24"/>
+          <w:szCs w:val="24"/>
         </w:rPr>
         <w:t>Patch Identification</w:t>
       </w:r>
     </w:p>
     <w:p>
-      <w:r>
+      <w:pPr>
+        <w:rPr>
+          <w:rFonts w:ascii="Times New Roman" w:hAnsi="Times New Roman" w:cs="Times New Roman"/>
+          <w:sz w:val="24"/>
+          <w:szCs w:val="24"/>
+        </w:rPr>
+      </w:pPr>
+      <w:r>
+        <w:rPr>
+          <w:rFonts w:ascii="Times New Roman" w:hAnsi="Times New Roman" w:cs="Times New Roman"/>
+          <w:sz w:val="24"/>
+          <w:szCs w:val="24"/>
+        </w:rPr>
         <w:t>Security bulletins and vendor notifications shall be reviewed weekly.</w:t>
       </w:r>
     </w:p>
     <w:p>
       <w:pPr>
         <w:rPr>
-          <w:b/>
-          <w:bCs/>
-        </w:rPr>
-      </w:pPr>
-      <w:r>
-        <w:rPr>
-          <w:b/>
-          <w:bCs/>
-        </w:rPr>
+          <w:rFonts w:ascii="Times New Roman" w:hAnsi="Times New Roman" w:cs="Times New Roman"/>
+          <w:b/>
+          <w:bCs/>
+          <w:sz w:val="24"/>
+          <w:szCs w:val="24"/>
+        </w:rPr>
+      </w:pPr>
+      <w:r>
+        <w:rPr>
+          <w:rFonts w:ascii="Times New Roman" w:hAnsi="Times New Roman" w:cs="Times New Roman"/>
+          <w:b/>
+          <w:bCs/>
+          <w:sz w:val="24"/>
+          <w:szCs w:val="24"/>
+        </w:rPr>
+        <w:lastRenderedPageBreak/>
         <w:t>Patch Classification and Deployment Timelines</w:t>
       </w:r>
     </w:p>
     <w:p>
-      <w:r>
-        <w:lastRenderedPageBreak/>
+      <w:pPr>
+        <w:rPr>
+          <w:rFonts w:ascii="Times New Roman" w:hAnsi="Times New Roman" w:cs="Times New Roman"/>
+          <w:sz w:val="24"/>
+          <w:szCs w:val="24"/>
+        </w:rPr>
+      </w:pPr>
+      <w:r>
+        <w:rPr>
+          <w:rFonts w:ascii="Times New Roman" w:hAnsi="Times New Roman" w:cs="Times New Roman"/>
+          <w:sz w:val="24"/>
+          <w:szCs w:val="24"/>
+        </w:rPr>
         <w:t>Critical patches must be deployed within 72 hours.</w:t>
       </w:r>
       <w:r>
+        <w:rPr>
+          <w:rFonts w:ascii="Times New Roman" w:hAnsi="Times New Roman" w:cs="Times New Roman"/>
+          <w:sz w:val="24"/>
+          <w:szCs w:val="24"/>
+        </w:rPr>
         <w:br/>
         <w:t>High-severity patches must be deployed within 7 days.</w:t>
       </w:r>
       <w:r>
+        <w:rPr>
+          <w:rFonts w:ascii="Times New Roman" w:hAnsi="Times New Roman" w:cs="Times New Roman"/>
+          <w:sz w:val="24"/>
+          <w:szCs w:val="24"/>
+        </w:rPr>
         <w:br/>
         <w:t>Medium-severity patches must be deployed within 30 days.</w:t>
       </w:r>
       <w:r>
+        <w:rPr>
+          <w:rFonts w:ascii="Times New Roman" w:hAnsi="Times New Roman" w:cs="Times New Roman"/>
+          <w:sz w:val="24"/>
+          <w:szCs w:val="24"/>
+        </w:rPr>
         <w:br/>
         <w:t>Low-severity patches must be deployed within 90 days.</w:t>
       </w:r>
@@ -900,165 +1729,333 @@
     <w:p>
       <w:pPr>
         <w:rPr>
-          <w:b/>
-          <w:bCs/>
-        </w:rPr>
-      </w:pPr>
-      <w:r>
-        <w:rPr>
-          <w:b/>
-          <w:bCs/>
+          <w:rFonts w:ascii="Times New Roman" w:hAnsi="Times New Roman" w:cs="Times New Roman"/>
+          <w:b/>
+          <w:bCs/>
+          <w:sz w:val="24"/>
+          <w:szCs w:val="24"/>
+        </w:rPr>
+      </w:pPr>
+      <w:r>
+        <w:rPr>
+          <w:rFonts w:ascii="Times New Roman" w:hAnsi="Times New Roman" w:cs="Times New Roman"/>
+          <w:b/>
+          <w:bCs/>
+          <w:sz w:val="24"/>
+          <w:szCs w:val="24"/>
         </w:rPr>
         <w:t>Testing Requirements</w:t>
       </w:r>
     </w:p>
     <w:p>
-      <w:r>
+      <w:pPr>
+        <w:rPr>
+          <w:rFonts w:ascii="Times New Roman" w:hAnsi="Times New Roman" w:cs="Times New Roman"/>
+          <w:sz w:val="24"/>
+          <w:szCs w:val="24"/>
+        </w:rPr>
+      </w:pPr>
+      <w:r>
+        <w:rPr>
+          <w:rFonts w:ascii="Times New Roman" w:hAnsi="Times New Roman" w:cs="Times New Roman"/>
+          <w:sz w:val="24"/>
+          <w:szCs w:val="24"/>
+        </w:rPr>
         <w:t>All patches must be tested in a staging environment prior to production deployment unless classified as emergency.</w:t>
       </w:r>
     </w:p>
     <w:p>
       <w:pPr>
         <w:rPr>
-          <w:b/>
-          <w:bCs/>
-        </w:rPr>
-      </w:pPr>
-      <w:r>
-        <w:rPr>
-          <w:b/>
-          <w:bCs/>
+          <w:rFonts w:ascii="Times New Roman" w:hAnsi="Times New Roman" w:cs="Times New Roman"/>
+          <w:b/>
+          <w:bCs/>
+          <w:sz w:val="24"/>
+          <w:szCs w:val="24"/>
+        </w:rPr>
+      </w:pPr>
+      <w:r>
+        <w:rPr>
+          <w:rFonts w:ascii="Times New Roman" w:hAnsi="Times New Roman" w:cs="Times New Roman"/>
+          <w:b/>
+          <w:bCs/>
+          <w:sz w:val="24"/>
+          <w:szCs w:val="24"/>
         </w:rPr>
         <w:t>Emergency Patch Process</w:t>
       </w:r>
     </w:p>
     <w:p>
-      <w:r>
+      <w:pPr>
+        <w:rPr>
+          <w:rFonts w:ascii="Times New Roman" w:hAnsi="Times New Roman" w:cs="Times New Roman"/>
+          <w:sz w:val="24"/>
+          <w:szCs w:val="24"/>
+        </w:rPr>
+      </w:pPr>
+      <w:r>
+        <w:rPr>
+          <w:rFonts w:ascii="Times New Roman" w:hAnsi="Times New Roman" w:cs="Times New Roman"/>
+          <w:sz w:val="24"/>
+          <w:szCs w:val="24"/>
+        </w:rPr>
         <w:t>Zero-day or actively exploited vulnerabilities require immediate risk assessment and expedited deployment within 24–72 hours.</w:t>
       </w:r>
     </w:p>
     <w:p>
       <w:pPr>
         <w:rPr>
-          <w:b/>
-          <w:bCs/>
-        </w:rPr>
-      </w:pPr>
-      <w:r>
-        <w:rPr>
-          <w:b/>
-          <w:bCs/>
+          <w:rFonts w:ascii="Times New Roman" w:hAnsi="Times New Roman" w:cs="Times New Roman"/>
+          <w:b/>
+          <w:bCs/>
+          <w:sz w:val="24"/>
+          <w:szCs w:val="24"/>
+        </w:rPr>
+      </w:pPr>
+      <w:r>
+        <w:rPr>
+          <w:rFonts w:ascii="Times New Roman" w:hAnsi="Times New Roman" w:cs="Times New Roman"/>
+          <w:b/>
+          <w:bCs/>
+          <w:sz w:val="24"/>
+          <w:szCs w:val="24"/>
         </w:rPr>
         <w:t>Change Management</w:t>
       </w:r>
     </w:p>
     <w:p>
-      <w:r>
+      <w:pPr>
+        <w:rPr>
+          <w:rFonts w:ascii="Times New Roman" w:hAnsi="Times New Roman" w:cs="Times New Roman"/>
+          <w:sz w:val="24"/>
+          <w:szCs w:val="24"/>
+        </w:rPr>
+      </w:pPr>
+      <w:r>
+        <w:rPr>
+          <w:rFonts w:ascii="Times New Roman" w:hAnsi="Times New Roman" w:cs="Times New Roman"/>
+          <w:sz w:val="24"/>
+          <w:szCs w:val="24"/>
+        </w:rPr>
         <w:t>Patch deployment must follow formal change management procedures, including rollback planning.</w:t>
       </w:r>
     </w:p>
     <w:p>
       <w:pPr>
         <w:rPr>
-          <w:b/>
-          <w:bCs/>
-        </w:rPr>
-      </w:pPr>
-      <w:r>
-        <w:rPr>
-          <w:b/>
-          <w:bCs/>
+          <w:rFonts w:ascii="Times New Roman" w:hAnsi="Times New Roman" w:cs="Times New Roman"/>
+          <w:b/>
+          <w:bCs/>
+          <w:sz w:val="24"/>
+          <w:szCs w:val="24"/>
+        </w:rPr>
+      </w:pPr>
+      <w:r>
+        <w:rPr>
+          <w:rFonts w:ascii="Times New Roman" w:hAnsi="Times New Roman" w:cs="Times New Roman"/>
+          <w:b/>
+          <w:bCs/>
+          <w:sz w:val="24"/>
+          <w:szCs w:val="24"/>
         </w:rPr>
         <w:t>Documentation and Review</w:t>
       </w:r>
     </w:p>
     <w:p>
-      <w:r>
+      <w:pPr>
+        <w:rPr>
+          <w:rFonts w:ascii="Times New Roman" w:hAnsi="Times New Roman" w:cs="Times New Roman"/>
+          <w:sz w:val="24"/>
+          <w:szCs w:val="24"/>
+        </w:rPr>
+      </w:pPr>
+      <w:r>
+        <w:rPr>
+          <w:rFonts w:ascii="Times New Roman" w:hAnsi="Times New Roman" w:cs="Times New Roman"/>
+          <w:sz w:val="24"/>
+          <w:szCs w:val="24"/>
+        </w:rPr>
         <w:t>Patch status reports shall be generated monthly and retained for audit purposes. This policy shall be reviewed annually.</w:t>
       </w:r>
     </w:p>
     <w:p>
-      <w:r>
+      <w:pPr>
+        <w:rPr>
+          <w:rFonts w:ascii="Times New Roman" w:hAnsi="Times New Roman" w:cs="Times New Roman"/>
+          <w:sz w:val="24"/>
+          <w:szCs w:val="24"/>
+        </w:rPr>
+      </w:pPr>
+      <w:r>
+        <w:rPr>
+          <w:rFonts w:ascii="Times New Roman" w:hAnsi="Times New Roman" w:cs="Times New Roman"/>
+          <w:sz w:val="24"/>
+          <w:szCs w:val="24"/>
+        </w:rPr>
         <w:pict w14:anchorId="6A6E4DBC">
-          <v:rect id="_x0000_i1086" style="width:0;height:1.5pt" o:hralign="center" o:hrstd="t" o:hr="t" fillcolor="#a0a0a0" stroked="f"/>
+          <v:rect id="_x0000_i1032" style="width:0;height:1.5pt" o:hralign="center" o:hrstd="t" o:hr="t" fillcolor="#a0a0a0" stroked="f"/>
         </w:pict>
       </w:r>
     </w:p>
     <w:p>
-      <w:r>
+      <w:pPr>
+        <w:rPr>
+          <w:rFonts w:ascii="Times New Roman" w:hAnsi="Times New Roman" w:cs="Times New Roman"/>
+          <w:sz w:val="24"/>
+          <w:szCs w:val="24"/>
+        </w:rPr>
+      </w:pPr>
+      <w:r>
+        <w:rPr>
+          <w:rFonts w:ascii="Times New Roman" w:hAnsi="Times New Roman" w:cs="Times New Roman"/>
+          <w:sz w:val="24"/>
+          <w:szCs w:val="24"/>
+        </w:rPr>
         <w:pict w14:anchorId="24A92700">
-          <v:rect id="_x0000_i1087" style="width:0;height:1.5pt" o:hralign="center" o:hrstd="t" o:hr="t" fillcolor="#a0a0a0" stroked="f"/>
+          <v:rect id="_x0000_i1033" style="width:0;height:1.5pt" o:hralign="center" o:hrstd="t" o:hr="t" fillcolor="#a0a0a0" stroked="f"/>
         </w:pict>
       </w:r>
     </w:p>
     <w:p>
       <w:pPr>
         <w:rPr>
-          <w:b/>
-          <w:bCs/>
-        </w:rPr>
-      </w:pPr>
-      <w:r>
-        <w:rPr>
-          <w:b/>
-          <w:bCs/>
+          <w:rFonts w:ascii="Times New Roman" w:hAnsi="Times New Roman" w:cs="Times New Roman"/>
+          <w:b/>
+          <w:bCs/>
+          <w:sz w:val="24"/>
+          <w:szCs w:val="24"/>
+        </w:rPr>
+      </w:pPr>
+      <w:r>
+        <w:rPr>
+          <w:rFonts w:ascii="Times New Roman" w:hAnsi="Times New Roman" w:cs="Times New Roman"/>
+          <w:b/>
+          <w:bCs/>
+          <w:sz w:val="24"/>
+          <w:szCs w:val="24"/>
         </w:rPr>
         <w:t xml:space="preserve">References </w:t>
       </w:r>
     </w:p>
     <w:p>
-      <w:r>
+      <w:pPr>
+        <w:rPr>
+          <w:rFonts w:ascii="Times New Roman" w:hAnsi="Times New Roman" w:cs="Times New Roman"/>
+          <w:sz w:val="24"/>
+          <w:szCs w:val="24"/>
+        </w:rPr>
+      </w:pPr>
+      <w:r>
+        <w:rPr>
+          <w:rFonts w:ascii="Times New Roman" w:hAnsi="Times New Roman" w:cs="Times New Roman"/>
+          <w:sz w:val="24"/>
+          <w:szCs w:val="24"/>
+        </w:rPr>
         <w:t xml:space="preserve">National Institute of Standards and Technology. (2013). </w:t>
       </w:r>
       <w:r>
         <w:rPr>
+          <w:rFonts w:ascii="Times New Roman" w:hAnsi="Times New Roman" w:cs="Times New Roman"/>
           <w:i/>
           <w:iCs/>
+          <w:sz w:val="24"/>
+          <w:szCs w:val="24"/>
         </w:rPr>
         <w:t>Guide to enterprise patch management technologies (SP 800-40 Rev. 3).</w:t>
       </w:r>
       <w:r>
+        <w:rPr>
+          <w:rFonts w:ascii="Times New Roman" w:hAnsi="Times New Roman" w:cs="Times New Roman"/>
+          <w:sz w:val="24"/>
+          <w:szCs w:val="24"/>
+        </w:rPr>
         <w:t xml:space="preserve"> </w:t>
       </w:r>
       <w:hyperlink r:id="rId5" w:tgtFrame="_new" w:history="1">
         <w:r>
           <w:rPr>
             <w:rStyle w:val="Hyperlink"/>
+            <w:rFonts w:ascii="Times New Roman" w:hAnsi="Times New Roman" w:cs="Times New Roman"/>
+            <w:sz w:val="24"/>
+            <w:szCs w:val="24"/>
           </w:rPr>
           <w:t>https://doi.org/10.6028/NIST.SP.800-40r3</w:t>
         </w:r>
       </w:hyperlink>
     </w:p>
     <w:p>
-      <w:r>
+      <w:pPr>
+        <w:rPr>
+          <w:rFonts w:ascii="Times New Roman" w:hAnsi="Times New Roman" w:cs="Times New Roman"/>
+          <w:sz w:val="24"/>
+          <w:szCs w:val="24"/>
+        </w:rPr>
+      </w:pPr>
+      <w:r>
+        <w:rPr>
+          <w:rFonts w:ascii="Times New Roman" w:hAnsi="Times New Roman" w:cs="Times New Roman"/>
+          <w:sz w:val="24"/>
+          <w:szCs w:val="24"/>
+        </w:rPr>
         <w:t xml:space="preserve">International Organization for Standardization. (2022). </w:t>
       </w:r>
       <w:r>
         <w:rPr>
+          <w:rFonts w:ascii="Times New Roman" w:hAnsi="Times New Roman" w:cs="Times New Roman"/>
           <w:i/>
           <w:iCs/>
+          <w:sz w:val="24"/>
+          <w:szCs w:val="24"/>
         </w:rPr>
         <w:t>ISO/IEC 27001:2022 Information security management systems.</w:t>
       </w:r>
     </w:p>
     <w:p>
+      <w:pPr>
+        <w:rPr>
+          <w:rFonts w:ascii="Times New Roman" w:hAnsi="Times New Roman" w:cs="Times New Roman"/>
+          <w:sz w:val="24"/>
+          <w:szCs w:val="24"/>
+        </w:rPr>
+      </w:pPr>
       <w:proofErr w:type="spellStart"/>
       <w:r>
+        <w:rPr>
+          <w:rFonts w:ascii="Times New Roman" w:hAnsi="Times New Roman" w:cs="Times New Roman"/>
+          <w:sz w:val="24"/>
+          <w:szCs w:val="24"/>
+        </w:rPr>
         <w:t>Center</w:t>
       </w:r>
       <w:proofErr w:type="spellEnd"/>
       <w:r>
+        <w:rPr>
+          <w:rFonts w:ascii="Times New Roman" w:hAnsi="Times New Roman" w:cs="Times New Roman"/>
+          <w:sz w:val="24"/>
+          <w:szCs w:val="24"/>
+        </w:rPr>
         <w:t xml:space="preserve"> for Internet Security. (2021). </w:t>
       </w:r>
       <w:r>
         <w:rPr>
+          <w:rFonts w:ascii="Times New Roman" w:hAnsi="Times New Roman" w:cs="Times New Roman"/>
           <w:i/>
           <w:iCs/>
+          <w:sz w:val="24"/>
+          <w:szCs w:val="24"/>
         </w:rPr>
         <w:t>CIS controls v8.</w:t>
       </w:r>
     </w:p>
-    <w:p/>
+    <w:p>
+      <w:pPr>
+        <w:rPr>
+          <w:rFonts w:ascii="Times New Roman" w:hAnsi="Times New Roman" w:cs="Times New Roman"/>
+          <w:sz w:val="24"/>
+          <w:szCs w:val="24"/>
+        </w:rPr>
+      </w:pPr>
+    </w:p>
     <w:sectPr>
       <w:pgSz w:w="11906" w:h="16838"/>
       <w:pgMar w:top="1440" w:right="1440" w:bottom="1440" w:left="1440" w:header="708" w:footer="708" w:gutter="0"/>
@@ -2061,6 +3058,7 @@
   <w:style w:type="character" w:default="1" w:styleId="DefaultParagraphFont">
     <w:name w:val="Default Paragraph Font"/>
     <w:uiPriority w:val="1"/>
+    <w:semiHidden/>
     <w:unhideWhenUsed/>
   </w:style>
   <w:style w:type="table" w:default="1" w:styleId="TableNormal">

</xml_diff>